<commit_message>
Staff sign in with a password only: authenticator switched off
The office asked for the second factor to go. MFA_ENFORCED is now False, so
approvers and administrators are no longer sent through enrolment or asked
for a code, and the Authenticator card is hidden on a person's record. The
TOTP code, middleware and screens stay, and the MFA tests still run with the
setting forced on, so switching it back is one line.

The admin guide and UAT script, in Markdown and Word, describe the plain
sign-in.

Co-Authored-By: Claude Opus 5.5 <noreply@anthropic.com>
</commit_message>
<xml_diff>
--- a/docs/AIKOL Booking System - Admin Guide.docx
+++ b/docs/AIKOL Booking System - Admin Guide.docx
@@ -234,7 +234,7 @@
         <w:rPr>
           <w:color w:val="14675B"/>
         </w:rPr>
-        <w:t>1. Signing in with the authenticator</w:t>
+        <w:t xml:space="preserve">1. Signing in</w:t>
       </w:r>
     </w:p>
     <w:p>
@@ -242,133 +242,7 @@
         <w:jc w:val="left"/>
       </w:pPr>
       <w:r>
-        <w:t xml:space="preserve">Approvers and administrators sign in with a password </w:t>
-      </w:r>
-      <w:r>
-        <w:rPr>
-          <w:b/>
-        </w:rPr>
-        <w:t>and</w:t>
-      </w:r>
-      <w:r>
-        <w:t xml:space="preserve"> a six-digit code from an authenticator app on their phone (Google Authenticator, Microsoft Authenticator or Authy). Ordinary users are not asked for a code.</w:t>
-      </w:r>
-    </w:p>
-    <w:p>
-      <w:pPr>
-        <w:jc w:val="left"/>
-      </w:pPr>
-      <w:r>
-        <w:rPr>
-          <w:b/>
-        </w:rPr>
-        <w:t>The first time</w:t>
-      </w:r>
-      <w:r>
-        <w:t xml:space="preserve">, after your password you are shown a QR code. Scan it with the app, type the six digits the app shows, and continue. You are then shown </w:t>
-      </w:r>
-      <w:r>
-        <w:rPr>
-          <w:b/>
-        </w:rPr>
-        <w:t>ten recovery codes, once only</w:t>
-      </w:r>
-      <w:r>
-        <w:t>. Write them down or print them and keep them somewhere that is not your phone. Each works a single time, in place of the app's code, if your phone is lost.</w:t>
-      </w:r>
-    </w:p>
-    <w:p>
-      <w:pPr>
-        <w:jc w:val="left"/>
-      </w:pPr>
-      <w:r>
-        <w:rPr>
-          <w:b/>
-        </w:rPr>
-        <w:t>Every time after that</w:t>
-      </w:r>
-      <w:r>
-        <w:t>, type the six digits the app shows at that moment.</w:t>
-      </w:r>
-    </w:p>
-    <w:p>
-      <w:pPr>
-        <w:keepNext/>
-        <w:spacing w:before="120" w:after="40"/>
-        <w:jc w:val="center"/>
-      </w:pPr>
-      <w:r>
-        <w:drawing>
-          <wp:inline xmlns:a="http://schemas.openxmlformats.org/drawingml/2006/main" xmlns:pic="http://schemas.openxmlformats.org/drawingml/2006/picture">
-            <wp:extent cx="5580000" cy="3487500"/>
-            <wp:docPr id="1" name="Picture 1"/>
-            <wp:cNvGraphicFramePr>
-              <a:graphicFrameLocks noChangeAspect="1"/>
-            </wp:cNvGraphicFramePr>
-            <a:graphic>
-              <a:graphicData uri="http://schemas.openxmlformats.org/drawingml/2006/picture">
-                <pic:pic>
-                  <pic:nvPicPr>
-                    <pic:cNvPr id="0" name="00-enter-code.png"/>
-                    <pic:cNvPicPr/>
-                  </pic:nvPicPr>
-                  <pic:blipFill>
-                    <a:blip r:embed="rId9"/>
-                    <a:stretch>
-                      <a:fillRect/>
-                    </a:stretch>
-                  </pic:blipFill>
-                  <pic:spPr>
-                    <a:xfrm>
-                      <a:off x="0" y="0"/>
-                      <a:ext cx="5580000" cy="3487500"/>
-                    </a:xfrm>
-                    <a:prstGeom prst="rect"/>
-                  </pic:spPr>
-                </pic:pic>
-              </a:graphicData>
-            </a:graphic>
-          </wp:inline>
-        </w:drawing>
-      </w:r>
-    </w:p>
-    <w:p>
-      <w:pPr>
-        <w:jc w:val="center"/>
-      </w:pPr>
-      <w:r>
-        <w:rPr>
-          <w:i/>
-          <w:color w:val="65716D"/>
-          <w:sz w:val="18"/>
-        </w:rPr>
-        <w:t>After the password, the code from the authenticator app.</w:t>
-      </w:r>
-    </w:p>
-    <w:p>
-      <w:pPr>
-        <w:jc w:val="left"/>
-      </w:pPr>
-      <w:r>
-        <w:t xml:space="preserve">If a colleague loses both their phone and their recovery codes, open their record under </w:t>
-      </w:r>
-      <w:r>
-        <w:rPr>
-          <w:b/>
-        </w:rPr>
-        <w:t>People</w:t>
-      </w:r>
-      <w:r>
-        <w:t xml:space="preserve"> and choose </w:t>
-      </w:r>
-      <w:r>
-        <w:rPr>
-          <w:b/>
-        </w:rPr>
-        <w:t>Reset authenticator</w:t>
-      </w:r>
-      <w:r>
-        <w:t>. They set up a new one at their next sign-in. You cannot reset your own; ask another administrator.</w:t>
+        <w:t xml:space="preserve">Approvers and administrators sign in on the same page as everyone else, with their email address and password. No code from a phone is needed.</w:t>
       </w:r>
     </w:p>
     <w:p>
@@ -720,7 +594,7 @@
               <w:rPr>
                 <w:sz w:val="19"/>
               </w:rPr>
-              <w:t>Every account, roles and authenticators</w:t>
+              <w:t xml:space="preserve">Every account and its role</w:t>
             </w:r>
           </w:p>
         </w:tc>
@@ -2361,7 +2235,7 @@
           <w:color w:val="65716D"/>
           <w:sz w:val="18"/>
         </w:rPr>
-        <w:t>A person's record, with the authenticator section below.</w:t>
+        <w:t xml:space="preserve">A person's record.</w:t>
       </w:r>
     </w:p>
     <w:p>
@@ -2375,15 +2249,7 @@
         <w:t>Role.</w:t>
       </w:r>
       <w:r>
-        <w:t xml:space="preserve"> User, Approver or Administrator. A person made an approver or administrator is asked to</w:t>
-      </w:r>
-    </w:p>
-    <w:p>
-      <w:pPr>
-        <w:jc w:val="left"/>
-      </w:pPr>
-      <w:r>
-        <w:t>set up the authenticator at their next sign-in.</w:t>
+        <w:t xml:space="preserve"> User, Approver or Administrator.</w:t>
       </w:r>
     </w:p>
     <w:p>
@@ -3747,91 +3613,6 @@
                 <w:sz w:val="19"/>
               </w:rPr>
               <w:t>It is still active, or it has bookings. Make it inactive; that keeps its history.</w:t>
-            </w:r>
-          </w:p>
-        </w:tc>
-      </w:tr>
-      <w:tr>
-        <w:tc>
-          <w:tcPr>
-            <w:tcW w:type="dxa" w:w="4873"/>
-          </w:tcPr>
-          <w:p>
-            <w:pPr>
-              <w:spacing w:before="40" w:after="40"/>
-            </w:pPr>
-            <w:r/>
-            <w:r>
-              <w:rPr>
-                <w:sz w:val="19"/>
-              </w:rPr>
-              <w:t>A colleague is locked out of the authenticator</w:t>
-            </w:r>
-          </w:p>
-        </w:tc>
-        <w:tc>
-          <w:tcPr>
-            <w:tcW w:type="dxa" w:w="4873"/>
-          </w:tcPr>
-          <w:p>
-            <w:pPr>
-              <w:spacing w:before="40" w:after="40"/>
-            </w:pPr>
-            <w:r/>
-            <w:r>
-              <w:rPr>
-                <w:sz w:val="19"/>
-              </w:rPr>
-              <w:t xml:space="preserve">People, open their record, </w:t>
-            </w:r>
-            <w:r>
-              <w:rPr>
-                <w:b/>
-                <w:sz w:val="19"/>
-              </w:rPr>
-              <w:t>Reset authenticator</w:t>
-            </w:r>
-            <w:r>
-              <w:rPr>
-                <w:sz w:val="19"/>
-              </w:rPr>
-              <w:t>.</w:t>
-            </w:r>
-          </w:p>
-        </w:tc>
-      </w:tr>
-      <w:tr>
-        <w:tc>
-          <w:tcPr>
-            <w:tcW w:type="dxa" w:w="4873"/>
-          </w:tcPr>
-          <w:p>
-            <w:pPr>
-              <w:spacing w:before="40" w:after="40"/>
-            </w:pPr>
-            <w:r/>
-            <w:r>
-              <w:rPr>
-                <w:sz w:val="19"/>
-              </w:rPr>
-              <w:t>You are locked out of your own authenticator</w:t>
-            </w:r>
-          </w:p>
-        </w:tc>
-        <w:tc>
-          <w:tcPr>
-            <w:tcW w:type="dxa" w:w="4873"/>
-          </w:tcPr>
-          <w:p>
-            <w:pPr>
-              <w:spacing w:before="40" w:after="40"/>
-            </w:pPr>
-            <w:r/>
-            <w:r>
-              <w:rPr>
-                <w:sz w:val="19"/>
-              </w:rPr>
-              <w:t>Use a recovery code, or ask another administrator to reset it.</w:t>
             </w:r>
           </w:p>
         </w:tc>

</xml_diff>